<commit_message>
Safety WorkPermit Rev.3 - Personnel Position, Controller Filter & UI Improvements
- Add Personnel_Position column to dbo.Personnel (migration in setup-db.sql)
- Filter Controller dropdown to หัวหน้าแผนก/ส่วน, วิศวกร, ผู้บริหาร only (create & weekend pages)
- Weekend Request: remove company field, auto-fill controller phone, position auto-fill from Personnel/Contractor
- Contractor training dialog: replace text search with Select dropdown, fix UNC path, fix status field size
- Contractor page: rename filter label Normal → Allowed, add Check icon to Allowed status chip
- Weekend print: remove company row, reduce employee rows from 18 to 15
- Personnel page: add position dropdown field and column in table

Co-Authored-By: Claude Sonnet 4.6 <noreply@anthropic.com>
</commit_message>
<xml_diff>
--- a/public/Training_Record.docx
+++ b/public/Training_Record.docx
@@ -547,15 +547,7 @@
           <w:sz w:val="20"/>
           <w:szCs w:val="24"/>
         </w:rPr>
-        <w:t>Worker_</w:t>
-      </w:r>
-      <w:r>
-        <w:rPr>
-          <w:rFonts w:ascii="Tahoma" w:hAnsi="Tahoma" w:cs="Tahoma"/>
-          <w:sz w:val="20"/>
-          <w:szCs w:val="24"/>
-        </w:rPr>
-        <w:t>Tel</w:t>
+        <w:t>Worker_Tel</w:t>
       </w:r>
       <w:r>
         <w:rPr>
@@ -4329,7 +4321,7 @@
     <w:p>
       <w:pPr>
         <w:rPr>
-          <w:rFonts w:ascii="Tahoma" w:hAnsi="Tahoma" w:cs="Tahoma" w:hint="cs"/>
+          <w:rFonts w:ascii="Tahoma" w:hAnsi="Tahoma" w:cs="Tahoma"/>
           <w:sz w:val="20"/>
           <w:szCs w:val="24"/>
           <w:cs/>
@@ -5763,15 +5755,7 @@
           <w:sz w:val="20"/>
           <w:szCs w:val="24"/>
         </w:rPr>
-        <w:t>8</w:t>
-      </w:r>
-      <w:r>
-        <w:rPr>
-          <w:rFonts w:ascii="Tahoma" w:hAnsi="Tahoma" w:cs="Tahoma"/>
-          <w:sz w:val="20"/>
-          <w:szCs w:val="24"/>
-        </w:rPr>
-        <w:t xml:space="preserve">.1 </w:t>
+        <w:t xml:space="preserve">8.1 </w:t>
       </w:r>
       <w:r>
         <w:rPr>
@@ -6196,7 +6180,23 @@
           <w:sz w:val="20"/>
           <w:szCs w:val="24"/>
         </w:rPr>
-        <w:t xml:space="preserve"> column “Personnel_Tel” , interger(10) , null</w:t>
+        <w:t xml:space="preserve"> column “Personnel_Tel” , </w:t>
+      </w:r>
+      <w:r>
+        <w:rPr>
+          <w:rFonts w:ascii="Tahoma" w:hAnsi="Tahoma" w:cs="Tahoma"/>
+          <w:sz w:val="20"/>
+          <w:szCs w:val="24"/>
+        </w:rPr>
+        <w:t>nvarchar</w:t>
+      </w:r>
+      <w:r>
+        <w:rPr>
+          <w:rFonts w:ascii="Tahoma" w:hAnsi="Tahoma" w:cs="Tahoma"/>
+          <w:sz w:val="20"/>
+          <w:szCs w:val="24"/>
+        </w:rPr>
+        <w:t>(10) , null</w:t>
       </w:r>
       <w:r>
         <w:rPr>

</xml_diff>